<commit_message>
Add changes and new files
</commit_message>
<xml_diff>
--- a/docs/Lab01/Requirements_v2.0.docx
+++ b/docs/Lab01/Requirements_v2.0.docx
@@ -36,7 +36,18 @@
     </w:p>
     <w:p>
       <w:r>
-        <w:t>Aplicația trebuie să ofere funcționalități complete de gestiune (adăugare, modificare, ștergere, vizualizare), să asigure persistența datelor în fișiere (datele nu este obligatoriu să fie înțelese de către un om), precum și o interfață grafică intuitivă pentru utilizator.</w:t>
+        <w:t xml:space="preserve">Aplicația trebuie să ofere funcționalități complete de gestiune (adăugare, modificare, ștergere, vizualizare), să asigure persistența datelor în fișiere </w:t>
+      </w:r>
+      <w:r>
+        <w:rPr>
+          <w:b/>
+          <w:color w:val="FF0000"/>
+          <w:u w:val="single"/>
+        </w:rPr>
+        <w:t>(datele nu este obligatoriu să fie înțelese de către un om)</w:t>
+      </w:r>
+      <w:r>
+        <w:t>, precum și o interfață grafică intuitivă pentru utilizator.</w:t>
       </w:r>
     </w:p>
     <w:p>
@@ -123,12 +134,25 @@
     </w:p>
     <w:p>
       <w:r>
+        <w:rPr>
+          <w:b/>
+          <w:color w:val="FF0000"/>
+          <w:u w:val="single"/>
+        </w:rPr>
         <w:t>Produsul are un nume și un preț setat la adăugarea lui.</w:t>
       </w:r>
     </w:p>
     <w:p>
       <w:r>
-        <w:t>2. Fiecare produs trebuie să aparțină unui tip și unei categorii. Tipul și categoria vor fi reprezentate într-un String.</w:t>
+        <w:t xml:space="preserve">2. Fiecare produs trebuie să aparțină unui tip și unei categorii. </w:t>
+      </w:r>
+      <w:r>
+        <w:rPr>
+          <w:b/>
+          <w:color w:val="FF0000"/>
+          <w:u w:val="single"/>
+        </w:rPr>
+        <w:t>Tipul și categoria vor fi reprezentate într-un String.</w:t>
       </w:r>
     </w:p>
     <w:p>
@@ -214,7 +238,29 @@
     </w:p>
     <w:p>
       <w:r>
-        <w:t>8. La finalul fiecărei zile se salvează manual informațiile despre comenzile înregistrate și se calculează totalul zilei. Datele pot fi exportate în format CSV.</w:t>
+        <w:t xml:space="preserve">8. La finalul fiecărei zile se salvează </w:t>
+      </w:r>
+      <w:r>
+        <w:rPr>
+          <w:b/>
+          <w:color w:val="FF0000"/>
+          <w:u w:val="single"/>
+        </w:rPr>
+        <w:t>manual</w:t>
+      </w:r>
+      <w:r>
+        <w:t xml:space="preserve"> informațiile despre comenzile </w:t>
+      </w:r>
+      <w:r>
+        <w:rPr>
+          <w:b/>
+          <w:color w:val="FF0000"/>
+          <w:u w:val="single"/>
+        </w:rPr>
+        <w:t>înregistrate</w:t>
+      </w:r>
+      <w:r>
+        <w:t xml:space="preserve"> și se calculează totalul zilei. Datele pot fi exportate în format CSV.</w:t>
       </w:r>
     </w:p>
     <w:p>
@@ -257,6 +303,11 @@
     </w:p>
     <w:p>
       <w:r>
+        <w:rPr>
+          <w:b/>
+          <w:color w:val="FF0000"/>
+          <w:u w:val="single"/>
+        </w:rPr>
         <w:t>7. Aplicația trebuie să suporte un singur magazin cu un singur utilizator simultan.</w:t>
       </w:r>
     </w:p>

</xml_diff>